<commit_message>
Regenerate jury brief with corrected figures
Advisory tier 542 -> 84, total alerts 548 -> 90, stagnation 693 -> 694 days,
and the idle-funds rule now documented as requiring both a 40% unspent ratio
and a 2 Cr balance.

Co-Authored-By: Claude Opus 5 <noreply@anthropic.com>
</commit_message>
<xml_diff>
--- a/docs/NirmanDrishti-Jury-Brief.docx
+++ b/docs/NirmanDrishti-Jury-Brief.docx
@@ -609,7 +609,7 @@
                 <w:color w:val="8A5A00"/>
                 <w:sz w:val="20"/>
               </w:rPr>
-              <w:t>Say “six”, never “548”</w:t>
+              <w:t>Say “six”, never “90”</w:t>
             </w:r>
           </w:p>
           <w:p>
@@ -624,7 +624,7 @@
                 <w:color w:val="10151F"/>
                 <w:sz w:val="19"/>
               </w:rPr>
-              <w:t xml:space="preserve">The database holds 548 alerts, but 542 are low-specificity unspent-balance notices that fire on nearly every constituency. Leading with 548 invites the question "how many are real?" — and you lose the room. Lead with </w:t>
+              <w:t xml:space="preserve">The database holds 90 alerts, but 84 are constituency-level unspent-balance notices built on synthetic balances. Leading with 90 invites the question "how many are real?" — and you lose the room. Lead with </w:t>
             </w:r>
             <w:r>
               <w:rPr>
@@ -934,7 +934,7 @@
           <w:color w:val="56607A"/>
           <w:sz w:val="19"/>
         </w:rPr>
-        <w:t>Two critical, four high, 542 advisory. Name the advisory tier before a judge finds it.</w:t>
+        <w:t>Two critical, four high, 84 advisory. Name the advisory tier before a judge finds it.</w:t>
       </w:r>
     </w:p>
     <w:p>
@@ -953,7 +953,7 @@
           <w:color w:val="10151F"/>
           <w:sz w:val="19"/>
         </w:rPr>
-        <w:t>"We separate confirmed findings from advisory notices. Burying four real cases inside five hundred weak ones is how audit systems get ignored."</w:t>
+        <w:t>"We separate confirmed findings from advisory notices. Burying four real cases inside a pile of weaker ones is how audit systems get ignored."</w:t>
       </w:r>
     </w:p>
     <w:p>
@@ -1615,7 +1615,7 @@
                 <w:color w:val="10151F"/>
                 <w:sz w:val="18"/>
               </w:rPr>
-              <w:t>542  (unspent-balance tier)</w:t>
+              <w:t>84  (unspent-balance tier, synthetic balances)</w:t>
             </w:r>
           </w:p>
         </w:tc>
@@ -2472,7 +2472,7 @@
                 <w:color w:val="10151F"/>
                 <w:sz w:val="18"/>
               </w:rPr>
-              <w:t>548</w:t>
+              <w:t>90</w:t>
             </w:r>
           </w:p>
         </w:tc>
@@ -2493,7 +2493,7 @@
                 <w:color w:val="10151F"/>
                 <w:sz w:val="18"/>
               </w:rPr>
-              <w:t>Generated — 6 confirmed, 542 advisory</w:t>
+              <w:t>Generated — 6 confirmed, 84 advisory</w:t>
             </w:r>
           </w:p>
         </w:tc>
@@ -4607,7 +4607,7 @@
           <w:color w:val="10151F"/>
           <w:sz w:val="20"/>
         </w:rPr>
-        <w:t>A SQL query selects works below the completion threshold; Python computes elapsed days since sanction. Flagged at 180+ days below 20% progress. A second constituency-level rule reports unspent balances.</w:t>
+        <w:t>A SQL query selects works below the completion threshold; Python computes elapsed days since sanction. Flagged at 180+ days below 20% progress. A second constituency-level rule reports unspent balances, requiring both a ≥ 40% unspent ratio and a ≥ ₹2 Cr balance.</w:t>
       </w:r>
     </w:p>
     <w:p>
@@ -5087,7 +5087,7 @@
                 <w:color w:val="10151F"/>
                 <w:sz w:val="18"/>
               </w:rPr>
-              <w:t>≥ ₹2.00 Cr unspent</w:t>
+              <w:t>≥ ₹2.00 Cr and ≥ 40% unspent</w:t>
             </w:r>
           </w:p>
         </w:tc>
@@ -5321,7 +5321,7 @@
           <w:color w:val="8A5A00"/>
           <w:sz w:val="34"/>
         </w:rPr>
-        <w:t>693 days</w:t>
+        <w:t>694 days</w:t>
       </w:r>
     </w:p>
     <w:p>
@@ -5352,7 +5352,7 @@
           <w:color w:val="10151F"/>
           <w:sz w:val="16"/>
         </w:rPr>
-        <w:t>Elapsed Days = 693 &gt;= 180 Threshold. Progress = 5%.</w:t>
+        <w:t>Elapsed Days = 694 &gt;= 180 Threshold. Progress = 5%.</w:t>
       </w:r>
     </w:p>
     <w:p>
@@ -5521,7 +5521,7 @@
           <w:color w:val="10151F"/>
           <w:sz w:val="20"/>
         </w:rPr>
-        <w:t>693 days will have grown</w:t>
+        <w:t>694 days will have grown</w:t>
       </w:r>
       <w:r>
         <w:rPr>
@@ -6340,7 +6340,7 @@
           <w:color w:val="0F2544"/>
           <w:sz w:val="20"/>
         </w:rPr>
-        <w:t>Q.  Why are there 548 alerts if only six are real?</w:t>
+        <w:t>Q.  Why are there 90 alerts if only six are real?</w:t>
       </w:r>
     </w:p>
     <w:p>
@@ -6356,7 +6356,7 @@
           <w:color w:val="10151F"/>
           <w:sz w:val="19"/>
         </w:rPr>
-        <w:t xml:space="preserve">Answer directly. "542 of those are unspent-balance advisories. Our demo seed gives every constituency the same unspent ratio, so that rule fires almost universally — it is a threshold problem, not a detection problem. </w:t>
+        <w:t xml:space="preserve">Answer directly. "84 of those are constituency-level unspent-balance notices. The published allocation dataset has no expenditure column, so those balances are generated — we say so openly. The rule needs both a 40% unspent ratio and a 2 crore balance, which flags 84 of 543. </w:t>
       </w:r>
       <w:r>
         <w:rPr>
@@ -6366,7 +6366,7 @@
           <w:color w:val="10151F"/>
           <w:sz w:val="19"/>
         </w:rPr>
-        <w:t>We report it in a separate advisory tier and exclude it from headline counts precisely so it does not drown the six real findings."</w:t>
+        <w:t>They sit in a separate advisory tier and are excluded from headline counts precisely so they do not drown the six real findings."</w:t>
       </w:r>
     </w:p>
     <w:p>
@@ -6624,7 +6624,7 @@
                 <w:color w:val="8A5A00"/>
                 <w:sz w:val="20"/>
               </w:rPr>
-              <w:t>1  ·  Advisory tier is 542 of 548 alerts</w:t>
+              <w:t>1  ·  Advisory tier is 84 of 90 alerts</w:t>
             </w:r>
           </w:p>
           <w:p>
@@ -6639,7 +6639,7 @@
                 <w:color w:val="10151F"/>
                 <w:sz w:val="19"/>
               </w:rPr>
-              <w:t>Surfaced and labelled in the UI, which defuses it — but have the answer ready.</w:t>
+              <w:t>Built on synthetic balances, surfaced and labelled separately in the UI — but have the answer ready.</w:t>
             </w:r>
           </w:p>
         </w:tc>
@@ -6988,7 +6988,7 @@
           <w:color w:val="10151F"/>
           <w:sz w:val="20"/>
         </w:rPr>
-        <w:t>Overview shows 6 confirmed findings — not a dash, not 548</w:t>
+        <w:t>Overview shows 6 confirmed findings — not a dash, not 90</w:t>
       </w:r>
     </w:p>
     <w:p>
@@ -7142,7 +7142,7 @@
           <w:color w:val="10151F"/>
           <w:sz w:val="20"/>
         </w:rPr>
-        <w:t>Everyone knows: say SIX findings, never 548</w:t>
+        <w:t>Everyone knows: say SIX findings, never 90</w:t>
       </w:r>
     </w:p>
     <w:p>

</xml_diff>